<commit_message>
correção no relatorio e coldstart
</commit_message>
<xml_diff>
--- a/Relatorio.docx
+++ b/Relatorio.docx
@@ -331,7 +331,7 @@
           <w:sz w:val="22"/>
           <w:szCs w:val="22"/>
         </w:rPr>
-        <w:t xml:space="preserve">O BRIEF (Binary Robust Independent Elementary Features, Calonder et al. 2012) constrói um descritor binário comparando, para cada keypoint, as intensidades de pares de pontos amostrados num patch à sua volta (numa versão ligeiramente desfocada da imagem, para reduzir sensibilidade a ruído): se o primeiro pixel do par é mais escuro que o segundo, o bit correspondente é 1, caso contrário é 0. O padrão de pares é fixo e reusado em todos os keypoints/imagens. Implementámos esta descrição de raiz (sem recorrer ao BRIEF do opencv-contrib), com duas estratégias de amostragem do padrão de pares: uniforme (pares aleatórios uniformemente distribuídos no patch de 31×31) e gaussiana (pares amostrados de uma Gaussiana isotrópica centrada no keypoint, aproximando a estratégia "G I" do paper original). O BRIEF não estima orientação — ao contrário do rBRIEF usado no ORB — pelo que não é invariante a rotação, uma limitação conhecida e esperada. Nos nossos resultados (secção 3), a estratégia gaussiana supera consistentemente a uniforme em todas as quatro scenes testadas, replicando a conclusão do paper original: concentrar os pares de teste perto do centro do keypoint produz bits mais estáveis e discriminativos do que amostrar uniformemente todo o patch, onde muitos pares acabam demasiado afastados um do outro para capturar estrutura local relevante.</w:t>
+        <w:t xml:space="preserve">O BRIEF (Binary Robust Independent Elementary Features, Calonder et al. 2012) constrói um descritor binário comparando, para cada keypoint, as intensidades de pares de pontos amostrados num patch à sua volta (numa versão ligeiramente desfocada da imagem, para reduzir sensibilidade a ruído): se o primeiro pixel do par é mais escuro que o segundo, o bit correspondente é 1, caso contrário é 0. O padrão de pares é fixo e reusado em todos os keypoints/imagens. Implementámos esta descrição de raiz (sem recorrer ao BRIEF do opencv-contrib), com duas estratégias de amostragem do padrão de pares: uniforme (pares aleatórios uniformemente distribuídos no patch de 31×31, aproximando a estratégia "G I" do paper original) e gaussiana (pares amostrados de uma Gaussiana isotrópica centrada no keypoint, aproximando a estratégia "G II" do paper original — a que os autores reportam como a de melhor desempenho). O BRIEF não estima orientação — ao contrário do rBRIEF usado no ORB — pelo que não é invariante a rotação, uma limitação conhecida e esperada. Nos nossos resultados (secção 3), a estratégia gaussiana supera consistentemente a uniforme em todas as quatro scenes testadas, replicando a conclusão do paper original: concentrar os pares de teste perto do centro do keypoint produz bits mais estáveis e discriminativos do que amostrar uniformemente todo o patch, onde muitos pares acabam demasiado afastados um do outro para capturar estrutura local relevante.</w:t>
       </w:r>
     </w:p>
     <w:p>
@@ -668,6 +668,20 @@
     </w:p>
     <w:p>
       <w:pPr>
+        <w:spacing w:after="140" w:line="276"/>
+        <w:jc w:val="both"/>
+      </w:pPr>
+      <w:r>
+        <w:rPr>
+          <w:rFonts w:ascii="Calibri" w:cs="Calibri" w:eastAsia="Calibri" w:hAnsi="Calibri"/>
+          <w:sz w:val="22"/>
+          <w:szCs w:val="22"/>
+        </w:rPr>
+        <w:t xml:space="preserve">Nota metodológica importante sobre a linha "SuperPoint + LightGlue" nas tabelas 1–4: ao contrário dos outros 8 métodos — onde keypoints_img1/img2, repeatability, PMR, precision, matching score e recall são calculados sobre a totalidade dos pontos detetados em cada imagem, independentemente de haver ou não matching — o LightGlue só devolve pontos já emparelhados com confiança (acima do seu threshold interno). Nesta linha, keypoints_img1 e keypoints_img2 são portanto o mesmo conjunto (e do mesmo tamanho) que os matches, e repeatability/PMR/precision/matching score/recall acabam por medir, na prática, sobretudo a qualidade do matching em si (um ponto já confirmado como correspondência vai quase sempre projetar-se perto do seu par) e não uma propriedade independente da deteção — por isso os valores desta linha tendem a ser muito altos e próximos uns dos outros (e PMR é sempre ≈100%), e não devem ser lidos como diretamente comparáveis, coluna a coluna, com os das outras 8 configurações. A linha "SuperPoint + BF" é que isola a repeatability/qualidade de deteção do SuperPoint de forma comparável às restantes.</w:t>
+      </w:r>
+    </w:p>
+    <w:p>
+      <w:pPr>
         <w:pStyle w:val="Heading2"/>
         <w:spacing w:after="120" w:before="220"/>
       </w:pPr>
@@ -1097,7 +1111,7 @@
                 <w:sz w:val="17"/>
                 <w:szCs w:val="17"/>
               </w:rPr>
-              <w:t xml:space="preserve">33</w:t>
+              <w:t xml:space="preserve">45</w:t>
             </w:r>
           </w:p>
         </w:tc>
@@ -1288,7 +1302,7 @@
                 <w:sz w:val="17"/>
                 <w:szCs w:val="17"/>
               </w:rPr>
-              <w:t xml:space="preserve">69</w:t>
+              <w:t xml:space="preserve">59</w:t>
             </w:r>
           </w:p>
         </w:tc>
@@ -1479,7 +1493,7 @@
                 <w:sz w:val="17"/>
                 <w:szCs w:val="17"/>
               </w:rPr>
-              <w:t xml:space="preserve">122</w:t>
+              <w:t xml:space="preserve">68</w:t>
             </w:r>
           </w:p>
         </w:tc>
@@ -1861,7 +1875,7 @@
                 <w:sz w:val="17"/>
                 <w:szCs w:val="17"/>
               </w:rPr>
-              <w:t xml:space="preserve">99</w:t>
+              <w:t xml:space="preserve">76</w:t>
             </w:r>
           </w:p>
         </w:tc>
@@ -2052,7 +2066,7 @@
                 <w:sz w:val="17"/>
                 <w:szCs w:val="17"/>
               </w:rPr>
-              <w:t xml:space="preserve">112</w:t>
+              <w:t xml:space="preserve">110</w:t>
             </w:r>
           </w:p>
         </w:tc>
@@ -2243,7 +2257,7 @@
                 <w:sz w:val="17"/>
                 <w:szCs w:val="17"/>
               </w:rPr>
-              <w:t xml:space="preserve">46</w:t>
+              <w:t xml:space="preserve">45</w:t>
             </w:r>
           </w:p>
         </w:tc>
@@ -2434,7 +2448,7 @@
                 <w:sz w:val="17"/>
                 <w:szCs w:val="17"/>
               </w:rPr>
-              <w:t xml:space="preserve">5771</w:t>
+              <w:t xml:space="preserve">2136</w:t>
             </w:r>
           </w:p>
         </w:tc>
@@ -2625,7 +2639,7 @@
                 <w:sz w:val="17"/>
                 <w:szCs w:val="17"/>
               </w:rPr>
-              <w:t xml:space="preserve">2339</w:t>
+              <w:t xml:space="preserve">2640</w:t>
             </w:r>
           </w:p>
         </w:tc>
@@ -3053,7 +3067,7 @@
                 <w:sz w:val="17"/>
                 <w:szCs w:val="17"/>
               </w:rPr>
-              <w:t xml:space="preserve">33</w:t>
+              <w:t xml:space="preserve">35</w:t>
             </w:r>
           </w:p>
         </w:tc>
@@ -3435,7 +3449,7 @@
                 <w:sz w:val="17"/>
                 <w:szCs w:val="17"/>
               </w:rPr>
-              <w:t xml:space="preserve">66</w:t>
+              <w:t xml:space="preserve">59</w:t>
             </w:r>
           </w:p>
         </w:tc>
@@ -3626,7 +3640,7 @@
                 <w:sz w:val="17"/>
                 <w:szCs w:val="17"/>
               </w:rPr>
-              <w:t xml:space="preserve">118</w:t>
+              <w:t xml:space="preserve">117</w:t>
             </w:r>
           </w:p>
         </w:tc>
@@ -3817,7 +3831,7 @@
                 <w:sz w:val="17"/>
                 <w:szCs w:val="17"/>
               </w:rPr>
-              <w:t xml:space="preserve">79</w:t>
+              <w:t xml:space="preserve">77</w:t>
             </w:r>
           </w:p>
         </w:tc>
@@ -4008,7 +4022,7 @@
                 <w:sz w:val="17"/>
                 <w:szCs w:val="17"/>
               </w:rPr>
-              <w:t xml:space="preserve">73</w:t>
+              <w:t xml:space="preserve">84</w:t>
             </w:r>
           </w:p>
         </w:tc>
@@ -4199,7 +4213,7 @@
                 <w:sz w:val="17"/>
                 <w:szCs w:val="17"/>
               </w:rPr>
-              <w:t xml:space="preserve">47</w:t>
+              <w:t xml:space="preserve">49</w:t>
             </w:r>
           </w:p>
         </w:tc>
@@ -4390,7 +4404,7 @@
                 <w:sz w:val="17"/>
                 <w:szCs w:val="17"/>
               </w:rPr>
-              <w:t xml:space="preserve">1586</w:t>
+              <w:t xml:space="preserve">1655</w:t>
             </w:r>
           </w:p>
         </w:tc>
@@ -4581,7 +4595,7 @@
                 <w:sz w:val="17"/>
                 <w:szCs w:val="17"/>
               </w:rPr>
-              <w:t xml:space="preserve">1735</w:t>
+              <w:t xml:space="preserve">1783</w:t>
             </w:r>
           </w:p>
         </w:tc>
@@ -5094,7 +5108,7 @@
                 <w:sz w:val="17"/>
                 <w:szCs w:val="17"/>
               </w:rPr>
-              <w:t xml:space="preserve">61</w:t>
+              <w:t xml:space="preserve">56</w:t>
             </w:r>
           </w:p>
         </w:tc>
@@ -5285,7 +5299,7 @@
                 <w:sz w:val="17"/>
                 <w:szCs w:val="17"/>
               </w:rPr>
-              <w:t xml:space="preserve">14</w:t>
+              <w:t xml:space="preserve">13</w:t>
             </w:r>
           </w:p>
         </w:tc>
@@ -5476,7 +5490,7 @@
                 <w:sz w:val="17"/>
                 <w:szCs w:val="17"/>
               </w:rPr>
-              <w:t xml:space="preserve">125</w:t>
+              <w:t xml:space="preserve">134</w:t>
             </w:r>
           </w:p>
         </w:tc>
@@ -5667,7 +5681,7 @@
                 <w:sz w:val="17"/>
                 <w:szCs w:val="17"/>
               </w:rPr>
-              <w:t xml:space="preserve">43</w:t>
+              <w:t xml:space="preserve">40</w:t>
             </w:r>
           </w:p>
         </w:tc>
@@ -5858,7 +5872,7 @@
                 <w:sz w:val="17"/>
                 <w:szCs w:val="17"/>
               </w:rPr>
-              <w:t xml:space="preserve">48</w:t>
+              <w:t xml:space="preserve">45</w:t>
             </w:r>
           </w:p>
         </w:tc>
@@ -6049,7 +6063,7 @@
                 <w:sz w:val="17"/>
                 <w:szCs w:val="17"/>
               </w:rPr>
-              <w:t xml:space="preserve">46</w:t>
+              <w:t xml:space="preserve">44</w:t>
             </w:r>
           </w:p>
         </w:tc>
@@ -6240,7 +6254,7 @@
                 <w:sz w:val="17"/>
                 <w:szCs w:val="17"/>
               </w:rPr>
-              <w:t xml:space="preserve">49</w:t>
+              <w:t xml:space="preserve">32</w:t>
             </w:r>
           </w:p>
         </w:tc>
@@ -6431,7 +6445,7 @@
                 <w:sz w:val="17"/>
                 <w:szCs w:val="17"/>
               </w:rPr>
-              <w:t xml:space="preserve">1831</w:t>
+              <w:t xml:space="preserve">1602</w:t>
             </w:r>
           </w:p>
         </w:tc>
@@ -6622,7 +6636,7 @@
                 <w:sz w:val="17"/>
                 <w:szCs w:val="17"/>
               </w:rPr>
-              <w:t xml:space="preserve">1708</w:t>
+              <w:t xml:space="preserve">1876</w:t>
             </w:r>
           </w:p>
         </w:tc>
@@ -7050,7 +7064,7 @@
                 <w:sz w:val="17"/>
                 <w:szCs w:val="17"/>
               </w:rPr>
-              <w:t xml:space="preserve">54</w:t>
+              <w:t xml:space="preserve">52</w:t>
             </w:r>
           </w:p>
         </w:tc>
@@ -7432,7 +7446,7 @@
                 <w:sz w:val="17"/>
                 <w:szCs w:val="17"/>
               </w:rPr>
-              <w:t xml:space="preserve">108</w:t>
+              <w:t xml:space="preserve">109</w:t>
             </w:r>
           </w:p>
         </w:tc>
@@ -7623,7 +7637,7 @@
                 <w:sz w:val="17"/>
                 <w:szCs w:val="17"/>
               </w:rPr>
-              <w:t xml:space="preserve">45</w:t>
+              <w:t xml:space="preserve">40</w:t>
             </w:r>
           </w:p>
         </w:tc>
@@ -7814,7 +7828,7 @@
                 <w:sz w:val="17"/>
                 <w:szCs w:val="17"/>
               </w:rPr>
-              <w:t xml:space="preserve">94</w:t>
+              <w:t xml:space="preserve">89</w:t>
             </w:r>
           </w:p>
         </w:tc>
@@ -8005,7 +8019,7 @@
                 <w:sz w:val="17"/>
                 <w:szCs w:val="17"/>
               </w:rPr>
-              <w:t xml:space="preserve">82</w:t>
+              <w:t xml:space="preserve">83</w:t>
             </w:r>
           </w:p>
         </w:tc>
@@ -8387,7 +8401,7 @@
                 <w:sz w:val="17"/>
                 <w:szCs w:val="17"/>
               </w:rPr>
-              <w:t xml:space="preserve">1668</w:t>
+              <w:t xml:space="preserve">1773</w:t>
             </w:r>
           </w:p>
         </w:tc>
@@ -8578,7 +8592,7 @@
                 <w:sz w:val="17"/>
                 <w:szCs w:val="17"/>
               </w:rPr>
-              <w:t xml:space="preserve">2211</w:t>
+              <w:t xml:space="preserve">2051</w:t>
             </w:r>
           </w:p>
         </w:tc>
@@ -9153,7 +9167,7 @@
                 <w:sz w:val="17"/>
                 <w:szCs w:val="17"/>
               </w:rPr>
-              <w:t xml:space="preserve">29.5</w:t>
+              <w:t xml:space="preserve">29.8</w:t>
             </w:r>
           </w:p>
         </w:tc>
@@ -9535,7 +9549,7 @@
                 <w:sz w:val="17"/>
                 <w:szCs w:val="17"/>
               </w:rPr>
-              <w:t xml:space="preserve">2.6</w:t>
+              <w:t xml:space="preserve">1.9</w:t>
             </w:r>
           </w:p>
         </w:tc>
@@ -9726,7 +9740,7 @@
                 <w:sz w:val="17"/>
                 <w:szCs w:val="17"/>
               </w:rPr>
-              <w:t xml:space="preserve">2.4</w:t>
+              <w:t xml:space="preserve">5.0</w:t>
             </w:r>
           </w:p>
         </w:tc>
@@ -9917,7 +9931,7 @@
                 <w:sz w:val="17"/>
                 <w:szCs w:val="17"/>
               </w:rPr>
-              <w:t xml:space="preserve">1.6</w:t>
+              <w:t xml:space="preserve">1.4</w:t>
             </w:r>
           </w:p>
         </w:tc>
@@ -10108,7 +10122,7 @@
                 <w:sz w:val="17"/>
                 <w:szCs w:val="17"/>
               </w:rPr>
-              <w:t xml:space="preserve">1.3</w:t>
+              <w:t xml:space="preserve">1.4</w:t>
             </w:r>
           </w:p>
         </w:tc>
@@ -10299,7 +10313,7 @@
                 <w:sz w:val="17"/>
                 <w:szCs w:val="17"/>
               </w:rPr>
-              <w:t xml:space="preserve">1.0</w:t>
+              <w:t xml:space="preserve">1.1</w:t>
             </w:r>
           </w:p>
         </w:tc>
@@ -10490,7 +10504,7 @@
                 <w:sz w:val="17"/>
                 <w:szCs w:val="17"/>
               </w:rPr>
-              <w:t xml:space="preserve">1.2</w:t>
+              <w:t xml:space="preserve">1.0</w:t>
             </w:r>
           </w:p>
         </w:tc>
@@ -12156,7 +12170,7 @@
           <w:sz w:val="22"/>
           <w:szCs w:val="22"/>
         </w:rPr>
-        <w:t xml:space="preserve">Os tempos de deteção+matching (última coluna das tabelas 1–4) resumem o espetro de custo computacional testado: o ORB é o mais rápido dos métodos com descritor próprio (14–69ms), o FAST+descritor fica na mesma ordem de grandeza (46–120ms), o SIFT/KAZE/BRISK ficam entre 30–125ms, e os métodos aprendidos são claramente os mais lentos em CPU — o SuperPoint sozinho varia entre 1.3s e 5.8s por par de imagens (dependendo fortemente da resolução da imagem: as imagens GRAF, 320×400, são muito mais lentas a processar pela primeira vez do que as HPatches 480×640 devido a efeitos de *warm-up* e carregamento de pesos), e o SuperPoint+LightGlue fica entre 1.7–2.3s. Isto define claramente o trade-off: para aplicações em tempo real (SLAM, tracking, robótica embebida), FAST+descritor binário ou ORB são as escolhas óbvias, aceitando pior robustez a condições difíceis; quando a prioridade é a precisão de matching em condições adversas de iluminação ou viewpoint — e o orçamento computacional permite correr uma rede neuronal, mesmo que em CPU — o SuperPoint+LightGlue é claramente o método mais robusto entre os testados.</w:t>
+        <w:t xml:space="preserve">Os tempos de deteção+matching (última coluna das tabelas 1–4) resumem o espetro de custo computacional testado: o ORB é o mais rápido dos métodos com descritor próprio (13–59ms), o FAST+descritor fica na mesma ordem de grandeza (32–120ms), o SIFT/KAZE/BRISK ficam entre 35–134ms, e os métodos aprendidos são claramente os mais lentos em CPU — o SuperPoint sozinho fica entre 1.6s e 2.1s por par de imagens, e o SuperPoint+LightGlue entre 1.8–2.6s. (Nota metodológica: os pesos pré-treinados do SuperPoint/LightGlue são carregados uma única vez, antes de qualquer cronometragem — função `warmup_learned_models()` — precisamente para evitar que esse custo, de vários segundos, contaminasse a medição do primeiro par de imagens processado; numa primeira versão deste trabalho esse carregamento não estava isolado do tempo medido, inflacionando artificialmente o primeiro valor em ~3.5s — corrigido antes dos resultados finais aqui reportados.) Isto define claramente o trade-off: para aplicações em tempo real (SLAM, tracking, robótica embebida), FAST+descritor binário ou ORB são as escolhas óbvias, aceitando pior robustez a condições difíceis; quando a prioridade é a precisão de matching em condições adversas de iluminação ou viewpoint — e o orçamento computacional permite correr uma rede neuronal, mesmo que em CPU — o SuperPoint+LightGlue é claramente o método mais robusto entre os testados.</w:t>
       </w:r>
     </w:p>
     <w:p>
@@ -12373,7 +12387,7 @@
           <w:sz w:val="22"/>
           <w:szCs w:val="22"/>
         </w:rPr>
-        <w:t xml:space="preserve">Limitações: o BRIEF implementado não é invariante a rotação (por desenho, sem orientação); só uma sequência de iluminação do HPatches foi usada (os resultados podem não generalizar a outras cenas); os números de inliers/outliers do RANSAC têm alguma variabilidade entre execuções devido à amostragem aleatória interna do OpenCV; os métodos aprendidos correram exclusivamente em CPU, pelo que os tempos reportados não refletem o desempenho que seria possível com GPU; o stitching multi-imagem usa blending por média simples, sem otimização de costura nem blending multi-banda. Direções futuras incluem avaliar mais sequências HPatches (incluindo viewpoint `v_*`), comparar LightGlue com SuperGlue diretamente, medir o ganho de usar GPU para os métodos aprendidos, e implementar blending mais avançado (feathering ou multi-banda) para o stitching multi-imagem.</w:t>
+        <w:t xml:space="preserve">Limitações: o BRIEF implementado não é invariante a rotação (por desenho, sem orientação); só uma sequência de iluminação do HPatches foi usada (os resultados podem não generalizar a outras cenas); os números de inliers/outliers do RANSAC têm alguma variabilidade entre execuções devido à amostragem aleatória interna do OpenCV; os métodos aprendidos correram exclusivamente em CPU, pelo que os tempos reportados não refletem o desempenho que seria possível com GPU; o stitching multi-imagem usa blending por média simples, sem otimização de costura nem blending multi-banda; o ORB foi configurado com um limite explícito de 1500 keypoints (`nfeatures=1500`) enquanto SIFT/KAZE/BRISK não têm limite, pelo que a coluna de número de keypoints não é totalmente comparável para o ORB (as restantes métricas, não sendo contagens absolutas, não são afetadas); e, como notado na secção 3.4, as métricas de repeatability/PMR/precision/matching score/recall da linha SuperPoint+LightGlue não são diretamente comparáveis às das restantes configurações, por serem calculadas sobre o conjunto já emparelhado em vez da totalidade dos pontos detetados. Direções futuras incluem avaliar mais sequências HPatches (incluindo viewpoint `v_*`), comparar LightGlue com SuperGlue diretamente, medir o ganho de usar GPU para os métodos aprendidos, e implementar blending mais avançado (feathering ou multi-banda) para o stitching multi-imagem.</w:t>
       </w:r>
     </w:p>
     <w:p>

</xml_diff>